<commit_message>
Validate data and calculations
</commit_message>
<xml_diff>
--- a/docs/Project_Management_Plan_INV-02.docx
+++ b/docs/Project_Management_Plan_INV-02.docx
@@ -556,6 +556,14 @@
               </w:rPr>
               <w:t>Complete</w:t>
             </w:r>
+            <w:r>
+              <w:rPr>
+                <w:b/>
+                <w:color w:val="1E293B"/>
+                <w:sz w:val="14"/>
+              </w:rPr>
+              <w:t>d</w:t>
+            </w:r>
           </w:p>
         </w:tc>
         <w:tc>
@@ -762,7 +770,7 @@
                 <w:color w:val="1E293B"/>
                 <w:sz w:val="14"/>
               </w:rPr>
-              <w:t>In progress</w:t>
+              <w:t>completed</w:t>
             </w:r>
           </w:p>
         </w:tc>
@@ -787,7 +795,7 @@
                 <w:color w:val="1E293B"/>
                 <w:sz w:val="14"/>
               </w:rPr>
-              <w:t>—</w:t>
+              <w:t>2026 – 10 - 15</w:t>
             </w:r>
           </w:p>
         </w:tc>
@@ -970,7 +978,7 @@
                 <w:color w:val="1E293B"/>
                 <w:sz w:val="14"/>
               </w:rPr>
-              <w:t>Blocked</w:t>
+              <w:t>completed</w:t>
             </w:r>
           </w:p>
         </w:tc>
@@ -995,7 +1003,7 @@
                 <w:color w:val="1E293B"/>
                 <w:sz w:val="14"/>
               </w:rPr>
-              <w:t>—</w:t>
+              <w:t>2026 – 10 - 15</w:t>
             </w:r>
           </w:p>
         </w:tc>
@@ -1178,7 +1186,7 @@
                 <w:color w:val="1E293B"/>
                 <w:sz w:val="14"/>
               </w:rPr>
-              <w:t>Planned</w:t>
+              <w:t>completed</w:t>
             </w:r>
           </w:p>
         </w:tc>
@@ -1203,7 +1211,7 @@
                 <w:color w:val="1E293B"/>
                 <w:sz w:val="14"/>
               </w:rPr>
-              <w:t>—</w:t>
+              <w:t>2026 – 10 - 16</w:t>
             </w:r>
           </w:p>
         </w:tc>
@@ -1386,7 +1394,7 @@
                 <w:color w:val="1E293B"/>
                 <w:sz w:val="14"/>
               </w:rPr>
-              <w:t>Planned</w:t>
+              <w:t>completed</w:t>
             </w:r>
           </w:p>
         </w:tc>
@@ -1411,7 +1419,7 @@
                 <w:color w:val="1E293B"/>
                 <w:sz w:val="14"/>
               </w:rPr>
-              <w:t>—</w:t>
+              <w:t xml:space="preserve">2026 – 10 - </w:t>
             </w:r>
           </w:p>
         </w:tc>

</xml_diff>

<commit_message>
docs: update README project progress Document PM-01 to PM-06 and synthetic data limitations
</commit_message>
<xml_diff>
--- a/docs/Project_Management_Plan_INV-02.docx
+++ b/docs/Project_Management_Plan_INV-02.docx
@@ -74,7 +74,14 @@
                 <w:color w:val="1E293B"/>
                 <w:sz w:val="16"/>
               </w:rPr>
-              <w:t>Two weeks (14 planned working days)</w:t>
+              <w:t xml:space="preserve">8 </w:t>
+            </w:r>
+            <w:r>
+              <w:rPr>
+                <w:color w:val="1E293B"/>
+                <w:sz w:val="16"/>
+              </w:rPr>
+              <w:t>planned working days</w:t>
             </w:r>
           </w:p>
         </w:tc>
@@ -160,16 +167,7 @@
         <w:spacing w:line="252" w:lineRule="auto"/>
       </w:pPr>
       <w:r>
-        <w:t xml:space="preserve">Record each task’s status, actual completion date, issues and associated Git commit as work proceeds. A blank completion date means the task is not complete. </w:t>
-      </w:r>
-      <w:r>
-        <w:rPr>
-          <w:i/>
-        </w:rPr>
-        <w:t>N/A — repository not initialized</w:t>
-      </w:r>
-      <w:r>
-        <w:t xml:space="preserve"> is used until this folder is a Git repository.</w:t>
+        <w:t xml:space="preserve">Record each task’s status, actual completion date, issues and associated Git commit as work proceeds. </w:t>
       </w:r>
     </w:p>
     <w:p>
@@ -183,7 +181,16 @@
         <w:t xml:space="preserve">Status values: </w:t>
       </w:r>
       <w:r>
-        <w:t>Complete  |  In progress  |  Blocked  |  Planned</w:t>
+        <w:t>Complete |</w:t>
+      </w:r>
+      <w:r>
+        <w:t xml:space="preserve">  In </w:t>
+      </w:r>
+      <w:r>
+        <w:t>progress |</w:t>
+      </w:r>
+      <w:r>
+        <w:t xml:space="preserve">  Blocked  |  Planned</w:t>
       </w:r>
     </w:p>
     <w:tbl>
@@ -204,12 +211,10 @@
       <w:tblGrid>
         <w:gridCol w:w="691"/>
         <w:gridCol w:w="2188"/>
-        <w:gridCol w:w="1267"/>
         <w:gridCol w:w="1756"/>
         <w:gridCol w:w="1123"/>
         <w:gridCol w:w="1180"/>
         <w:gridCol w:w="3096"/>
-        <w:gridCol w:w="2880"/>
       </w:tblGrid>
       <w:tr>
         <w:trPr>
@@ -266,32 +271,6 @@
                 <w:sz w:val="14"/>
               </w:rPr>
               <w:t>Task</w:t>
-            </w:r>
-          </w:p>
-        </w:tc>
-        <w:tc>
-          <w:tcPr>
-            <w:tcW w:w="1267" w:type="dxa"/>
-            <w:shd w:val="clear" w:color="auto" w:fill="17365D"/>
-            <w:tcMar>
-              <w:top w:w="70" w:type="dxa"/>
-              <w:left w:w="80" w:type="dxa"/>
-              <w:bottom w:w="70" w:type="dxa"/>
-              <w:right w:w="80" w:type="dxa"/>
-            </w:tcMar>
-            <w:vAlign w:val="center"/>
-          </w:tcPr>
-          <w:p>
-            <w:pPr>
-              <w:spacing w:after="0" w:line="240" w:lineRule="auto"/>
-            </w:pPr>
-            <w:r>
-              <w:rPr>
-                <w:b/>
-                <w:color w:val="FFFFFF"/>
-                <w:sz w:val="14"/>
-              </w:rPr>
-              <w:t>Planned timing</w:t>
             </w:r>
           </w:p>
         </w:tc>
@@ -399,32 +378,6 @@
             </w:r>
           </w:p>
         </w:tc>
-        <w:tc>
-          <w:tcPr>
-            <w:tcW w:w="2880" w:type="dxa"/>
-            <w:shd w:val="clear" w:color="auto" w:fill="17365D"/>
-            <w:tcMar>
-              <w:top w:w="70" w:type="dxa"/>
-              <w:left w:w="80" w:type="dxa"/>
-              <w:bottom w:w="70" w:type="dxa"/>
-              <w:right w:w="80" w:type="dxa"/>
-            </w:tcMar>
-            <w:vAlign w:val="center"/>
-          </w:tcPr>
-          <w:p>
-            <w:pPr>
-              <w:spacing w:after="0" w:line="240" w:lineRule="auto"/>
-            </w:pPr>
-            <w:r>
-              <w:rPr>
-                <w:b/>
-                <w:color w:val="FFFFFF"/>
-                <w:sz w:val="14"/>
-              </w:rPr>
-              <w:t>Git commit</w:t>
-            </w:r>
-          </w:p>
-        </w:tc>
       </w:tr>
       <w:tr>
         <w:trPr>
@@ -484,31 +437,6 @@
         </w:tc>
         <w:tc>
           <w:tcPr>
-            <w:tcW w:w="1267" w:type="dxa"/>
-            <w:shd w:val="clear" w:color="auto" w:fill="FFFFFF"/>
-            <w:tcMar>
-              <w:top w:w="70" w:type="dxa"/>
-              <w:left w:w="80" w:type="dxa"/>
-              <w:bottom w:w="70" w:type="dxa"/>
-              <w:right w:w="80" w:type="dxa"/>
-            </w:tcMar>
-            <w:vAlign w:val="center"/>
-          </w:tcPr>
-          <w:p>
-            <w:pPr>
-              <w:spacing w:after="0" w:line="240" w:lineRule="auto"/>
-            </w:pPr>
-            <w:r>
-              <w:rPr>
-                <w:color w:val="1E293B"/>
-                <w:sz w:val="14"/>
-              </w:rPr>
-              <w:t>Week 1, Day 1</w:t>
-            </w:r>
-          </w:p>
-        </w:tc>
-        <w:tc>
-          <w:tcPr>
             <w:tcW w:w="1756" w:type="dxa"/>
             <w:shd w:val="clear" w:color="auto" w:fill="FFFFFF"/>
             <w:tcMar>
@@ -554,15 +482,7 @@
                 <w:color w:val="1E293B"/>
                 <w:sz w:val="14"/>
               </w:rPr>
-              <w:t>Complete</w:t>
-            </w:r>
-            <w:r>
-              <w:rPr>
-                <w:b/>
-                <w:color w:val="1E293B"/>
-                <w:sz w:val="14"/>
-              </w:rPr>
-              <w:t>d</w:t>
+              <w:t>Completed</w:t>
             </w:r>
           </w:p>
         </w:tc>
@@ -613,31 +533,6 @@
                 <w:sz w:val="14"/>
               </w:rPr>
               <w:t>Baseline proposal and folder structure prepared; source CSV still absent.</w:t>
-            </w:r>
-          </w:p>
-        </w:tc>
-        <w:tc>
-          <w:tcPr>
-            <w:tcW w:w="2880" w:type="dxa"/>
-            <w:shd w:val="clear" w:color="auto" w:fill="FFFFFF"/>
-            <w:tcMar>
-              <w:top w:w="70" w:type="dxa"/>
-              <w:left w:w="80" w:type="dxa"/>
-              <w:bottom w:w="70" w:type="dxa"/>
-              <w:right w:w="80" w:type="dxa"/>
-            </w:tcMar>
-            <w:vAlign w:val="center"/>
-          </w:tcPr>
-          <w:p>
-            <w:pPr>
-              <w:spacing w:after="0" w:line="240" w:lineRule="auto"/>
-            </w:pPr>
-            <w:r>
-              <w:rPr>
-                <w:color w:val="1E293B"/>
-                <w:sz w:val="14"/>
-              </w:rPr>
-              <w:t>N/A — repository not initialized</w:t>
             </w:r>
           </w:p>
         </w:tc>
@@ -695,31 +590,6 @@
                 <w:sz w:val="14"/>
               </w:rPr>
               <w:t>Source and document dataset</w:t>
-            </w:r>
-          </w:p>
-        </w:tc>
-        <w:tc>
-          <w:tcPr>
-            <w:tcW w:w="1267" w:type="dxa"/>
-            <w:shd w:val="clear" w:color="auto" w:fill="F4F7FB"/>
-            <w:tcMar>
-              <w:top w:w="70" w:type="dxa"/>
-              <w:left w:w="80" w:type="dxa"/>
-              <w:bottom w:w="70" w:type="dxa"/>
-              <w:right w:w="80" w:type="dxa"/>
-            </w:tcMar>
-            <w:vAlign w:val="center"/>
-          </w:tcPr>
-          <w:p>
-            <w:pPr>
-              <w:spacing w:after="0" w:line="240" w:lineRule="auto"/>
-            </w:pPr>
-            <w:r>
-              <w:rPr>
-                <w:color w:val="1E293B"/>
-                <w:sz w:val="14"/>
-              </w:rPr>
-              <w:t>Week 1, Day 1</w:t>
             </w:r>
           </w:p>
         </w:tc>
@@ -824,31 +694,6 @@
             </w:r>
           </w:p>
         </w:tc>
-        <w:tc>
-          <w:tcPr>
-            <w:tcW w:w="2880" w:type="dxa"/>
-            <w:shd w:val="clear" w:color="auto" w:fill="F4F7FB"/>
-            <w:tcMar>
-              <w:top w:w="70" w:type="dxa"/>
-              <w:left w:w="80" w:type="dxa"/>
-              <w:bottom w:w="70" w:type="dxa"/>
-              <w:right w:w="80" w:type="dxa"/>
-            </w:tcMar>
-            <w:vAlign w:val="center"/>
-          </w:tcPr>
-          <w:p>
-            <w:pPr>
-              <w:spacing w:after="0" w:line="240" w:lineRule="auto"/>
-            </w:pPr>
-            <w:r>
-              <w:rPr>
-                <w:color w:val="1E293B"/>
-                <w:sz w:val="14"/>
-              </w:rPr>
-              <w:t>N/A — repository not initialized</w:t>
-            </w:r>
-          </w:p>
-        </w:tc>
       </w:tr>
       <w:tr>
         <w:trPr>
@@ -903,31 +748,6 @@
                 <w:sz w:val="14"/>
               </w:rPr>
               <w:t>Profile dataset and inspect fields</w:t>
-            </w:r>
-          </w:p>
-        </w:tc>
-        <w:tc>
-          <w:tcPr>
-            <w:tcW w:w="1267" w:type="dxa"/>
-            <w:shd w:val="clear" w:color="auto" w:fill="FFFFFF"/>
-            <w:tcMar>
-              <w:top w:w="70" w:type="dxa"/>
-              <w:left w:w="80" w:type="dxa"/>
-              <w:bottom w:w="70" w:type="dxa"/>
-              <w:right w:w="80" w:type="dxa"/>
-            </w:tcMar>
-            <w:vAlign w:val="center"/>
-          </w:tcPr>
-          <w:p>
-            <w:pPr>
-              <w:spacing w:after="0" w:line="240" w:lineRule="auto"/>
-            </w:pPr>
-            <w:r>
-              <w:rPr>
-                <w:color w:val="1E293B"/>
-                <w:sz w:val="14"/>
-              </w:rPr>
-              <w:t>Week 1, Day 2</w:t>
             </w:r>
           </w:p>
         </w:tc>
@@ -1032,31 +852,6 @@
             </w:r>
           </w:p>
         </w:tc>
-        <w:tc>
-          <w:tcPr>
-            <w:tcW w:w="2880" w:type="dxa"/>
-            <w:shd w:val="clear" w:color="auto" w:fill="FFFFFF"/>
-            <w:tcMar>
-              <w:top w:w="70" w:type="dxa"/>
-              <w:left w:w="80" w:type="dxa"/>
-              <w:bottom w:w="70" w:type="dxa"/>
-              <w:right w:w="80" w:type="dxa"/>
-            </w:tcMar>
-            <w:vAlign w:val="center"/>
-          </w:tcPr>
-          <w:p>
-            <w:pPr>
-              <w:spacing w:after="0" w:line="240" w:lineRule="auto"/>
-            </w:pPr>
-            <w:r>
-              <w:rPr>
-                <w:color w:val="1E293B"/>
-                <w:sz w:val="14"/>
-              </w:rPr>
-              <w:t>N/A — repository not initialized</w:t>
-            </w:r>
-          </w:p>
-        </w:tc>
       </w:tr>
       <w:tr>
         <w:trPr>
@@ -1111,31 +906,6 @@
                 <w:sz w:val="14"/>
               </w:rPr>
               <w:t>Clean and prepare data in Excel</w:t>
-            </w:r>
-          </w:p>
-        </w:tc>
-        <w:tc>
-          <w:tcPr>
-            <w:tcW w:w="1267" w:type="dxa"/>
-            <w:shd w:val="clear" w:color="auto" w:fill="F4F7FB"/>
-            <w:tcMar>
-              <w:top w:w="70" w:type="dxa"/>
-              <w:left w:w="80" w:type="dxa"/>
-              <w:bottom w:w="70" w:type="dxa"/>
-              <w:right w:w="80" w:type="dxa"/>
-            </w:tcMar>
-            <w:vAlign w:val="center"/>
-          </w:tcPr>
-          <w:p>
-            <w:pPr>
-              <w:spacing w:after="0" w:line="240" w:lineRule="auto"/>
-            </w:pPr>
-            <w:r>
-              <w:rPr>
-                <w:color w:val="1E293B"/>
-                <w:sz w:val="14"/>
-              </w:rPr>
-              <w:t>Week 1, Days 2–3</w:t>
             </w:r>
           </w:p>
         </w:tc>
@@ -1240,31 +1010,6 @@
             </w:r>
           </w:p>
         </w:tc>
-        <w:tc>
-          <w:tcPr>
-            <w:tcW w:w="2880" w:type="dxa"/>
-            <w:shd w:val="clear" w:color="auto" w:fill="F4F7FB"/>
-            <w:tcMar>
-              <w:top w:w="70" w:type="dxa"/>
-              <w:left w:w="80" w:type="dxa"/>
-              <w:bottom w:w="70" w:type="dxa"/>
-              <w:right w:w="80" w:type="dxa"/>
-            </w:tcMar>
-            <w:vAlign w:val="center"/>
-          </w:tcPr>
-          <w:p>
-            <w:pPr>
-              <w:spacing w:after="0" w:line="240" w:lineRule="auto"/>
-            </w:pPr>
-            <w:r>
-              <w:rPr>
-                <w:color w:val="1E293B"/>
-                <w:sz w:val="14"/>
-              </w:rPr>
-              <w:t>N/A — repository not initialized</w:t>
-            </w:r>
-          </w:p>
-        </w:tc>
       </w:tr>
       <w:tr>
         <w:trPr>
@@ -1319,31 +1064,6 @@
                 <w:sz w:val="14"/>
               </w:rPr>
               <w:t>Validate data and calculations</w:t>
-            </w:r>
-          </w:p>
-        </w:tc>
-        <w:tc>
-          <w:tcPr>
-            <w:tcW w:w="1267" w:type="dxa"/>
-            <w:shd w:val="clear" w:color="auto" w:fill="FFFFFF"/>
-            <w:tcMar>
-              <w:top w:w="70" w:type="dxa"/>
-              <w:left w:w="80" w:type="dxa"/>
-              <w:bottom w:w="70" w:type="dxa"/>
-              <w:right w:w="80" w:type="dxa"/>
-            </w:tcMar>
-            <w:vAlign w:val="center"/>
-          </w:tcPr>
-          <w:p>
-            <w:pPr>
-              <w:spacing w:after="0" w:line="240" w:lineRule="auto"/>
-            </w:pPr>
-            <w:r>
-              <w:rPr>
-                <w:color w:val="1E293B"/>
-                <w:sz w:val="14"/>
-              </w:rPr>
-              <w:t>Week 1, Day 3</w:t>
             </w:r>
           </w:p>
         </w:tc>
@@ -1448,31 +1168,6 @@
             </w:r>
           </w:p>
         </w:tc>
-        <w:tc>
-          <w:tcPr>
-            <w:tcW w:w="2880" w:type="dxa"/>
-            <w:shd w:val="clear" w:color="auto" w:fill="FFFFFF"/>
-            <w:tcMar>
-              <w:top w:w="70" w:type="dxa"/>
-              <w:left w:w="80" w:type="dxa"/>
-              <w:bottom w:w="70" w:type="dxa"/>
-              <w:right w:w="80" w:type="dxa"/>
-            </w:tcMar>
-            <w:vAlign w:val="center"/>
-          </w:tcPr>
-          <w:p>
-            <w:pPr>
-              <w:spacing w:after="0" w:line="240" w:lineRule="auto"/>
-            </w:pPr>
-            <w:r>
-              <w:rPr>
-                <w:color w:val="1E293B"/>
-                <w:sz w:val="14"/>
-              </w:rPr>
-              <w:t>N/A — repository not initialized</w:t>
-            </w:r>
-          </w:p>
-        </w:tc>
       </w:tr>
       <w:tr>
         <w:trPr>
@@ -1532,31 +1227,6 @@
         </w:tc>
         <w:tc>
           <w:tcPr>
-            <w:tcW w:w="1267" w:type="dxa"/>
-            <w:shd w:val="clear" w:color="auto" w:fill="F4F7FB"/>
-            <w:tcMar>
-              <w:top w:w="70" w:type="dxa"/>
-              <w:left w:w="80" w:type="dxa"/>
-              <w:bottom w:w="70" w:type="dxa"/>
-              <w:right w:w="80" w:type="dxa"/>
-            </w:tcMar>
-            <w:vAlign w:val="center"/>
-          </w:tcPr>
-          <w:p>
-            <w:pPr>
-              <w:spacing w:after="0" w:line="240" w:lineRule="auto"/>
-            </w:pPr>
-            <w:r>
-              <w:rPr>
-                <w:color w:val="1E293B"/>
-                <w:sz w:val="14"/>
-              </w:rPr>
-              <w:t>Week 1, Days 4–5</w:t>
-            </w:r>
-          </w:p>
-        </w:tc>
-        <w:tc>
-          <w:tcPr>
             <w:tcW w:w="1756" w:type="dxa"/>
             <w:shd w:val="clear" w:color="auto" w:fill="F4F7FB"/>
             <w:tcMar>
@@ -1590,7 +1260,6 @@
               <w:bottom w:w="70" w:type="dxa"/>
               <w:right w:w="80" w:type="dxa"/>
             </w:tcMar>
-            <w:vAlign w:val="center"/>
           </w:tcPr>
           <w:p>
             <w:pPr>
@@ -1656,31 +1325,6 @@
             </w:r>
           </w:p>
         </w:tc>
-        <w:tc>
-          <w:tcPr>
-            <w:tcW w:w="2880" w:type="dxa"/>
-            <w:shd w:val="clear" w:color="auto" w:fill="F4F7FB"/>
-            <w:tcMar>
-              <w:top w:w="70" w:type="dxa"/>
-              <w:left w:w="80" w:type="dxa"/>
-              <w:bottom w:w="70" w:type="dxa"/>
-              <w:right w:w="80" w:type="dxa"/>
-            </w:tcMar>
-            <w:vAlign w:val="center"/>
-          </w:tcPr>
-          <w:p>
-            <w:pPr>
-              <w:spacing w:after="0" w:line="240" w:lineRule="auto"/>
-            </w:pPr>
-            <w:r>
-              <w:rPr>
-                <w:color w:val="1E293B"/>
-                <w:sz w:val="14"/>
-              </w:rPr>
-              <w:t>N/A — repository not initialized</w:t>
-            </w:r>
-          </w:p>
-        </w:tc>
       </w:tr>
       <w:tr>
         <w:trPr>
@@ -1740,31 +1384,6 @@
         </w:tc>
         <w:tc>
           <w:tcPr>
-            <w:tcW w:w="1267" w:type="dxa"/>
-            <w:shd w:val="clear" w:color="auto" w:fill="FFFFFF"/>
-            <w:tcMar>
-              <w:top w:w="70" w:type="dxa"/>
-              <w:left w:w="80" w:type="dxa"/>
-              <w:bottom w:w="70" w:type="dxa"/>
-              <w:right w:w="80" w:type="dxa"/>
-            </w:tcMar>
-            <w:vAlign w:val="center"/>
-          </w:tcPr>
-          <w:p>
-            <w:pPr>
-              <w:spacing w:after="0" w:line="240" w:lineRule="auto"/>
-            </w:pPr>
-            <w:r>
-              <w:rPr>
-                <w:color w:val="1E293B"/>
-                <w:sz w:val="14"/>
-              </w:rPr>
-              <w:t>Week 1, Days 5–7</w:t>
-            </w:r>
-          </w:p>
-        </w:tc>
-        <w:tc>
-          <w:tcPr>
             <w:tcW w:w="1756" w:type="dxa"/>
             <w:shd w:val="clear" w:color="auto" w:fill="FFFFFF"/>
             <w:tcMar>
@@ -1798,7 +1417,6 @@
               <w:bottom w:w="70" w:type="dxa"/>
               <w:right w:w="80" w:type="dxa"/>
             </w:tcMar>
-            <w:vAlign w:val="center"/>
           </w:tcPr>
           <w:p>
             <w:pPr>
@@ -1864,31 +1482,6 @@
             </w:r>
           </w:p>
         </w:tc>
-        <w:tc>
-          <w:tcPr>
-            <w:tcW w:w="2880" w:type="dxa"/>
-            <w:shd w:val="clear" w:color="auto" w:fill="FFFFFF"/>
-            <w:tcMar>
-              <w:top w:w="70" w:type="dxa"/>
-              <w:left w:w="80" w:type="dxa"/>
-              <w:bottom w:w="70" w:type="dxa"/>
-              <w:right w:w="80" w:type="dxa"/>
-            </w:tcMar>
-            <w:vAlign w:val="center"/>
-          </w:tcPr>
-          <w:p>
-            <w:pPr>
-              <w:spacing w:after="0" w:line="240" w:lineRule="auto"/>
-            </w:pPr>
-            <w:r>
-              <w:rPr>
-                <w:color w:val="1E293B"/>
-                <w:sz w:val="14"/>
-              </w:rPr>
-              <w:t>N/A — repository not initialized</w:t>
-            </w:r>
-          </w:p>
-        </w:tc>
       </w:tr>
       <w:tr>
         <w:trPr>
@@ -1948,31 +1541,6 @@
         </w:tc>
         <w:tc>
           <w:tcPr>
-            <w:tcW w:w="1267" w:type="dxa"/>
-            <w:shd w:val="clear" w:color="auto" w:fill="F4F7FB"/>
-            <w:tcMar>
-              <w:top w:w="70" w:type="dxa"/>
-              <w:left w:w="80" w:type="dxa"/>
-              <w:bottom w:w="70" w:type="dxa"/>
-              <w:right w:w="80" w:type="dxa"/>
-            </w:tcMar>
-            <w:vAlign w:val="center"/>
-          </w:tcPr>
-          <w:p>
-            <w:pPr>
-              <w:spacing w:after="0" w:line="240" w:lineRule="auto"/>
-            </w:pPr>
-            <w:r>
-              <w:rPr>
-                <w:color w:val="1E293B"/>
-                <w:sz w:val="14"/>
-              </w:rPr>
-              <w:t>Week 2, Day 8</w:t>
-            </w:r>
-          </w:p>
-        </w:tc>
-        <w:tc>
-          <w:tcPr>
             <w:tcW w:w="1756" w:type="dxa"/>
             <w:shd w:val="clear" w:color="auto" w:fill="F4F7FB"/>
             <w:tcMar>
@@ -2006,7 +1574,6 @@
               <w:bottom w:w="70" w:type="dxa"/>
               <w:right w:w="80" w:type="dxa"/>
             </w:tcMar>
-            <w:vAlign w:val="center"/>
           </w:tcPr>
           <w:p>
             <w:pPr>
@@ -2072,31 +1639,6 @@
             </w:r>
           </w:p>
         </w:tc>
-        <w:tc>
-          <w:tcPr>
-            <w:tcW w:w="2880" w:type="dxa"/>
-            <w:shd w:val="clear" w:color="auto" w:fill="F4F7FB"/>
-            <w:tcMar>
-              <w:top w:w="70" w:type="dxa"/>
-              <w:left w:w="80" w:type="dxa"/>
-              <w:bottom w:w="70" w:type="dxa"/>
-              <w:right w:w="80" w:type="dxa"/>
-            </w:tcMar>
-            <w:vAlign w:val="center"/>
-          </w:tcPr>
-          <w:p>
-            <w:pPr>
-              <w:spacing w:after="0" w:line="240" w:lineRule="auto"/>
-            </w:pPr>
-            <w:r>
-              <w:rPr>
-                <w:color w:val="1E293B"/>
-                <w:sz w:val="14"/>
-              </w:rPr>
-              <w:t>N/A — repository not initialized</w:t>
-            </w:r>
-          </w:p>
-        </w:tc>
       </w:tr>
       <w:tr>
         <w:trPr>
@@ -2156,31 +1698,6 @@
         </w:tc>
         <w:tc>
           <w:tcPr>
-            <w:tcW w:w="1267" w:type="dxa"/>
-            <w:shd w:val="clear" w:color="auto" w:fill="FFFFFF"/>
-            <w:tcMar>
-              <w:top w:w="70" w:type="dxa"/>
-              <w:left w:w="80" w:type="dxa"/>
-              <w:bottom w:w="70" w:type="dxa"/>
-              <w:right w:w="80" w:type="dxa"/>
-            </w:tcMar>
-            <w:vAlign w:val="center"/>
-          </w:tcPr>
-          <w:p>
-            <w:pPr>
-              <w:spacing w:after="0" w:line="240" w:lineRule="auto"/>
-            </w:pPr>
-            <w:r>
-              <w:rPr>
-                <w:color w:val="1E293B"/>
-                <w:sz w:val="14"/>
-              </w:rPr>
-              <w:t>Week 2, Day 8</w:t>
-            </w:r>
-          </w:p>
-        </w:tc>
-        <w:tc>
-          <w:tcPr>
             <w:tcW w:w="1756" w:type="dxa"/>
             <w:shd w:val="clear" w:color="auto" w:fill="FFFFFF"/>
             <w:tcMar>
@@ -2214,7 +1731,6 @@
               <w:bottom w:w="70" w:type="dxa"/>
               <w:right w:w="80" w:type="dxa"/>
             </w:tcMar>
-            <w:vAlign w:val="center"/>
           </w:tcPr>
           <w:p>
             <w:pPr>
@@ -2280,31 +1796,6 @@
             </w:r>
           </w:p>
         </w:tc>
-        <w:tc>
-          <w:tcPr>
-            <w:tcW w:w="2880" w:type="dxa"/>
-            <w:shd w:val="clear" w:color="auto" w:fill="FFFFFF"/>
-            <w:tcMar>
-              <w:top w:w="70" w:type="dxa"/>
-              <w:left w:w="80" w:type="dxa"/>
-              <w:bottom w:w="70" w:type="dxa"/>
-              <w:right w:w="80" w:type="dxa"/>
-            </w:tcMar>
-            <w:vAlign w:val="center"/>
-          </w:tcPr>
-          <w:p>
-            <w:pPr>
-              <w:spacing w:after="0" w:line="240" w:lineRule="auto"/>
-            </w:pPr>
-            <w:r>
-              <w:rPr>
-                <w:color w:val="1E293B"/>
-                <w:sz w:val="14"/>
-              </w:rPr>
-              <w:t>N/A — repository not initialized</w:t>
-            </w:r>
-          </w:p>
-        </w:tc>
       </w:tr>
       <w:tr>
         <w:trPr>
@@ -2364,31 +1855,6 @@
         </w:tc>
         <w:tc>
           <w:tcPr>
-            <w:tcW w:w="1267" w:type="dxa"/>
-            <w:shd w:val="clear" w:color="auto" w:fill="F4F7FB"/>
-            <w:tcMar>
-              <w:top w:w="70" w:type="dxa"/>
-              <w:left w:w="80" w:type="dxa"/>
-              <w:bottom w:w="70" w:type="dxa"/>
-              <w:right w:w="80" w:type="dxa"/>
-            </w:tcMar>
-            <w:vAlign w:val="center"/>
-          </w:tcPr>
-          <w:p>
-            <w:pPr>
-              <w:spacing w:after="0" w:line="240" w:lineRule="auto"/>
-            </w:pPr>
-            <w:r>
-              <w:rPr>
-                <w:color w:val="1E293B"/>
-                <w:sz w:val="14"/>
-              </w:rPr>
-              <w:t>Week 2, Days 9–10</w:t>
-            </w:r>
-          </w:p>
-        </w:tc>
-        <w:tc>
-          <w:tcPr>
             <w:tcW w:w="1756" w:type="dxa"/>
             <w:shd w:val="clear" w:color="auto" w:fill="F4F7FB"/>
             <w:tcMar>
@@ -2422,7 +1888,6 @@
               <w:bottom w:w="70" w:type="dxa"/>
               <w:right w:w="80" w:type="dxa"/>
             </w:tcMar>
-            <w:vAlign w:val="center"/>
           </w:tcPr>
           <w:p>
             <w:pPr>
@@ -2488,31 +1953,6 @@
             </w:r>
           </w:p>
         </w:tc>
-        <w:tc>
-          <w:tcPr>
-            <w:tcW w:w="2880" w:type="dxa"/>
-            <w:shd w:val="clear" w:color="auto" w:fill="F4F7FB"/>
-            <w:tcMar>
-              <w:top w:w="70" w:type="dxa"/>
-              <w:left w:w="80" w:type="dxa"/>
-              <w:bottom w:w="70" w:type="dxa"/>
-              <w:right w:w="80" w:type="dxa"/>
-            </w:tcMar>
-            <w:vAlign w:val="center"/>
-          </w:tcPr>
-          <w:p>
-            <w:pPr>
-              <w:spacing w:after="0" w:line="240" w:lineRule="auto"/>
-            </w:pPr>
-            <w:r>
-              <w:rPr>
-                <w:color w:val="1E293B"/>
-                <w:sz w:val="14"/>
-              </w:rPr>
-              <w:t>N/A — repository not initialized</w:t>
-            </w:r>
-          </w:p>
-        </w:tc>
       </w:tr>
       <w:tr>
         <w:trPr>
@@ -2572,31 +2012,6 @@
         </w:tc>
         <w:tc>
           <w:tcPr>
-            <w:tcW w:w="1267" w:type="dxa"/>
-            <w:shd w:val="clear" w:color="auto" w:fill="FFFFFF"/>
-            <w:tcMar>
-              <w:top w:w="70" w:type="dxa"/>
-              <w:left w:w="80" w:type="dxa"/>
-              <w:bottom w:w="70" w:type="dxa"/>
-              <w:right w:w="80" w:type="dxa"/>
-            </w:tcMar>
-            <w:vAlign w:val="center"/>
-          </w:tcPr>
-          <w:p>
-            <w:pPr>
-              <w:spacing w:after="0" w:line="240" w:lineRule="auto"/>
-            </w:pPr>
-            <w:r>
-              <w:rPr>
-                <w:color w:val="1E293B"/>
-                <w:sz w:val="14"/>
-              </w:rPr>
-              <w:t>Week 2, Day 11</w:t>
-            </w:r>
-          </w:p>
-        </w:tc>
-        <w:tc>
-          <w:tcPr>
             <w:tcW w:w="1756" w:type="dxa"/>
             <w:shd w:val="clear" w:color="auto" w:fill="FFFFFF"/>
             <w:tcMar>
@@ -2630,7 +2045,6 @@
               <w:bottom w:w="70" w:type="dxa"/>
               <w:right w:w="80" w:type="dxa"/>
             </w:tcMar>
-            <w:vAlign w:val="center"/>
           </w:tcPr>
           <w:p>
             <w:pPr>
@@ -2696,31 +2110,6 @@
             </w:r>
           </w:p>
         </w:tc>
-        <w:tc>
-          <w:tcPr>
-            <w:tcW w:w="2880" w:type="dxa"/>
-            <w:shd w:val="clear" w:color="auto" w:fill="FFFFFF"/>
-            <w:tcMar>
-              <w:top w:w="70" w:type="dxa"/>
-              <w:left w:w="80" w:type="dxa"/>
-              <w:bottom w:w="70" w:type="dxa"/>
-              <w:right w:w="80" w:type="dxa"/>
-            </w:tcMar>
-            <w:vAlign w:val="center"/>
-          </w:tcPr>
-          <w:p>
-            <w:pPr>
-              <w:spacing w:after="0" w:line="240" w:lineRule="auto"/>
-            </w:pPr>
-            <w:r>
-              <w:rPr>
-                <w:color w:val="1E293B"/>
-                <w:sz w:val="14"/>
-              </w:rPr>
-              <w:t>N/A — repository not initialized</w:t>
-            </w:r>
-          </w:p>
-        </w:tc>
       </w:tr>
       <w:tr>
         <w:trPr>
@@ -2780,31 +2169,6 @@
         </w:tc>
         <w:tc>
           <w:tcPr>
-            <w:tcW w:w="1267" w:type="dxa"/>
-            <w:shd w:val="clear" w:color="auto" w:fill="F4F7FB"/>
-            <w:tcMar>
-              <w:top w:w="70" w:type="dxa"/>
-              <w:left w:w="80" w:type="dxa"/>
-              <w:bottom w:w="70" w:type="dxa"/>
-              <w:right w:w="80" w:type="dxa"/>
-            </w:tcMar>
-            <w:vAlign w:val="center"/>
-          </w:tcPr>
-          <w:p>
-            <w:pPr>
-              <w:spacing w:after="0" w:line="240" w:lineRule="auto"/>
-            </w:pPr>
-            <w:r>
-              <w:rPr>
-                <w:color w:val="1E293B"/>
-                <w:sz w:val="14"/>
-              </w:rPr>
-              <w:t>Week 2, Day 12</w:t>
-            </w:r>
-          </w:p>
-        </w:tc>
-        <w:tc>
-          <w:tcPr>
             <w:tcW w:w="1756" w:type="dxa"/>
             <w:shd w:val="clear" w:color="auto" w:fill="F4F7FB"/>
             <w:tcMar>
@@ -2838,7 +2202,6 @@
               <w:bottom w:w="70" w:type="dxa"/>
               <w:right w:w="80" w:type="dxa"/>
             </w:tcMar>
-            <w:vAlign w:val="center"/>
           </w:tcPr>
           <w:p>
             <w:pPr>
@@ -2850,7 +2213,7 @@
                 <w:color w:val="1E293B"/>
                 <w:sz w:val="14"/>
               </w:rPr>
-              <w:t>In progress</w:t>
+              <w:t>Planned</w:t>
             </w:r>
           </w:p>
         </w:tc>
@@ -2901,31 +2264,6 @@
                 <w:sz w:val="14"/>
               </w:rPr>
               <w:t>Baseline documents created; update with verified results as work proceeds.</w:t>
-            </w:r>
-          </w:p>
-        </w:tc>
-        <w:tc>
-          <w:tcPr>
-            <w:tcW w:w="2880" w:type="dxa"/>
-            <w:shd w:val="clear" w:color="auto" w:fill="F4F7FB"/>
-            <w:tcMar>
-              <w:top w:w="70" w:type="dxa"/>
-              <w:left w:w="80" w:type="dxa"/>
-              <w:bottom w:w="70" w:type="dxa"/>
-              <w:right w:w="80" w:type="dxa"/>
-            </w:tcMar>
-            <w:vAlign w:val="center"/>
-          </w:tcPr>
-          <w:p>
-            <w:pPr>
-              <w:spacing w:after="0" w:line="240" w:lineRule="auto"/>
-            </w:pPr>
-            <w:r>
-              <w:rPr>
-                <w:color w:val="1E293B"/>
-                <w:sz w:val="14"/>
-              </w:rPr>
-              <w:t>N/A — repository not initialized</w:t>
             </w:r>
           </w:p>
         </w:tc>
@@ -2988,31 +2326,6 @@
         </w:tc>
         <w:tc>
           <w:tcPr>
-            <w:tcW w:w="1267" w:type="dxa"/>
-            <w:shd w:val="clear" w:color="auto" w:fill="FFFFFF"/>
-            <w:tcMar>
-              <w:top w:w="70" w:type="dxa"/>
-              <w:left w:w="80" w:type="dxa"/>
-              <w:bottom w:w="70" w:type="dxa"/>
-              <w:right w:w="80" w:type="dxa"/>
-            </w:tcMar>
-            <w:vAlign w:val="center"/>
-          </w:tcPr>
-          <w:p>
-            <w:pPr>
-              <w:spacing w:after="0" w:line="240" w:lineRule="auto"/>
-            </w:pPr>
-            <w:r>
-              <w:rPr>
-                <w:color w:val="1E293B"/>
-                <w:sz w:val="14"/>
-              </w:rPr>
-              <w:t>Week 2, Day 13</w:t>
-            </w:r>
-          </w:p>
-        </w:tc>
-        <w:tc>
-          <w:tcPr>
             <w:tcW w:w="1756" w:type="dxa"/>
             <w:shd w:val="clear" w:color="auto" w:fill="FFFFFF"/>
             <w:tcMar>
@@ -3046,7 +2359,6 @@
               <w:bottom w:w="70" w:type="dxa"/>
               <w:right w:w="80" w:type="dxa"/>
             </w:tcMar>
-            <w:vAlign w:val="center"/>
           </w:tcPr>
           <w:p>
             <w:pPr>
@@ -3112,31 +2424,6 @@
             </w:r>
           </w:p>
         </w:tc>
-        <w:tc>
-          <w:tcPr>
-            <w:tcW w:w="2880" w:type="dxa"/>
-            <w:shd w:val="clear" w:color="auto" w:fill="FFFFFF"/>
-            <w:tcMar>
-              <w:top w:w="70" w:type="dxa"/>
-              <w:left w:w="80" w:type="dxa"/>
-              <w:bottom w:w="70" w:type="dxa"/>
-              <w:right w:w="80" w:type="dxa"/>
-            </w:tcMar>
-            <w:vAlign w:val="center"/>
-          </w:tcPr>
-          <w:p>
-            <w:pPr>
-              <w:spacing w:after="0" w:line="240" w:lineRule="auto"/>
-            </w:pPr>
-            <w:r>
-              <w:rPr>
-                <w:color w:val="1E293B"/>
-                <w:sz w:val="14"/>
-              </w:rPr>
-              <w:t>N/A — repository not initialized</w:t>
-            </w:r>
-          </w:p>
-        </w:tc>
       </w:tr>
       <w:tr>
         <w:trPr>
@@ -3196,31 +2483,6 @@
         </w:tc>
         <w:tc>
           <w:tcPr>
-            <w:tcW w:w="1267" w:type="dxa"/>
-            <w:shd w:val="clear" w:color="auto" w:fill="F4F7FB"/>
-            <w:tcMar>
-              <w:top w:w="70" w:type="dxa"/>
-              <w:left w:w="80" w:type="dxa"/>
-              <w:bottom w:w="70" w:type="dxa"/>
-              <w:right w:w="80" w:type="dxa"/>
-            </w:tcMar>
-            <w:vAlign w:val="center"/>
-          </w:tcPr>
-          <w:p>
-            <w:pPr>
-              <w:spacing w:after="0" w:line="240" w:lineRule="auto"/>
-            </w:pPr>
-            <w:r>
-              <w:rPr>
-                <w:color w:val="1E293B"/>
-                <w:sz w:val="14"/>
-              </w:rPr>
-              <w:t>Week 2, Day 14</w:t>
-            </w:r>
-          </w:p>
-        </w:tc>
-        <w:tc>
-          <w:tcPr>
             <w:tcW w:w="1756" w:type="dxa"/>
             <w:shd w:val="clear" w:color="auto" w:fill="F4F7FB"/>
             <w:tcMar>
@@ -3254,7 +2516,6 @@
               <w:bottom w:w="70" w:type="dxa"/>
               <w:right w:w="80" w:type="dxa"/>
             </w:tcMar>
-            <w:vAlign w:val="center"/>
           </w:tcPr>
           <w:p>
             <w:pPr>
@@ -3320,31 +2581,6 @@
             </w:r>
           </w:p>
         </w:tc>
-        <w:tc>
-          <w:tcPr>
-            <w:tcW w:w="2880" w:type="dxa"/>
-            <w:shd w:val="clear" w:color="auto" w:fill="F4F7FB"/>
-            <w:tcMar>
-              <w:top w:w="70" w:type="dxa"/>
-              <w:left w:w="80" w:type="dxa"/>
-              <w:bottom w:w="70" w:type="dxa"/>
-              <w:right w:w="80" w:type="dxa"/>
-            </w:tcMar>
-            <w:vAlign w:val="center"/>
-          </w:tcPr>
-          <w:p>
-            <w:pPr>
-              <w:spacing w:after="0" w:line="240" w:lineRule="auto"/>
-            </w:pPr>
-            <w:r>
-              <w:rPr>
-                <w:color w:val="1E293B"/>
-                <w:sz w:val="14"/>
-              </w:rPr>
-              <w:t>N/A — repository not initialized</w:t>
-            </w:r>
-          </w:p>
-        </w:tc>
       </w:tr>
     </w:tbl>
     <w:p>
@@ -3369,8 +2605,21 @@
           <w:color w:val="334155"/>
           <w:sz w:val="17"/>
         </w:rPr>
-        <w:lastRenderedPageBreak/>
-        <w:t>Task durations are estimates. If data quality or dashboard work takes longer than planned, prioritise the validated analysis and core dashboard while preserving the two-week deadline. Record commits as work is completed rather than only at project end.</w:t>
+        <w:t xml:space="preserve">Task durations are estimates. If data quality or dashboard work takes longer than planned, prioritise the validated analysis and core dashboard while preserving the </w:t>
+      </w:r>
+      <w:r>
+        <w:rPr>
+          <w:color w:val="334155"/>
+          <w:sz w:val="17"/>
+        </w:rPr>
+        <w:t xml:space="preserve">8 days </w:t>
+      </w:r>
+      <w:r>
+        <w:rPr>
+          <w:color w:val="334155"/>
+          <w:sz w:val="17"/>
+        </w:rPr>
+        <w:t>deadline. Record commits as work is completed rather than only at project end.</w:t>
       </w:r>
     </w:p>
     <w:sectPr>
@@ -3422,39 +2671,7 @@
         <w:color w:val="64748B"/>
         <w:sz w:val="16"/>
       </w:rPr>
-      <w:t xml:space="preserve">Project Management </w:t>
-    </w:r>
-    <w:proofErr w:type="gramStart"/>
-    <w:r>
-      <w:rPr>
-        <w:color w:val="64748B"/>
-        <w:sz w:val="16"/>
-      </w:rPr>
-      <w:t>Plan  •</w:t>
-    </w:r>
-    <w:proofErr w:type="gramEnd"/>
-    <w:r>
-      <w:rPr>
-        <w:color w:val="64748B"/>
-        <w:sz w:val="16"/>
-      </w:rPr>
-      <w:t xml:space="preserve">  Baseline: 15 October </w:t>
-    </w:r>
-    <w:proofErr w:type="gramStart"/>
-    <w:r>
-      <w:rPr>
-        <w:color w:val="64748B"/>
-        <w:sz w:val="16"/>
-      </w:rPr>
-      <w:t>2026  •</w:t>
-    </w:r>
-    <w:proofErr w:type="gramEnd"/>
-    <w:r>
-      <w:rPr>
-        <w:color w:val="64748B"/>
-        <w:sz w:val="16"/>
-      </w:rPr>
-      <w:t xml:space="preserve">  Page </w:t>
+      <w:t xml:space="preserve">Project Management Plan  •  Baseline: 15 October 2026  •  Page </w:t>
     </w:r>
     <w:r>
       <w:fldChar w:fldCharType="begin"/>
@@ -3516,25 +2733,7 @@
         <w:color w:val="64748B"/>
         <w:sz w:val="16"/>
       </w:rPr>
-      <w:t xml:space="preserve">PROJECT </w:t>
-    </w:r>
-    <w:proofErr w:type="gramStart"/>
-    <w:r>
-      <w:rPr>
-        <w:b/>
-        <w:color w:val="64748B"/>
-        <w:sz w:val="16"/>
-      </w:rPr>
-      <w:t>MANAGEMENT  |</w:t>
-    </w:r>
-    <w:proofErr w:type="gramEnd"/>
-    <w:r>
-      <w:rPr>
-        <w:b/>
-        <w:color w:val="64748B"/>
-        <w:sz w:val="16"/>
-      </w:rPr>
-      <w:t xml:space="preserve">  INV-02</w:t>
+      <w:t>PROJECT MANAGEMENT  |  INV-02</w:t>
     </w:r>
   </w:p>
 </w:hdr>

</xml_diff>

<commit_message>
Build Power BI dashboard
</commit_message>
<xml_diff>
--- a/docs/Project_Management_Plan_INV-02.docx
+++ b/docs/Project_Management_Plan_INV-02.docx
@@ -181,17 +181,38 @@
         <w:t xml:space="preserve">Status values: </w:t>
       </w:r>
       <w:r>
-        <w:t>Complete |</w:t>
+        <w:t xml:space="preserve">Complete </w:t>
+      </w:r>
+      <w:proofErr w:type="gramStart"/>
+      <w:r>
+        <w:t>|</w:t>
       </w:r>
       <w:r>
-        <w:t xml:space="preserve">  In </w:t>
+        <w:t xml:space="preserve">  In</w:t>
+      </w:r>
+      <w:proofErr w:type="gramEnd"/>
+      <w:r>
+        <w:t xml:space="preserve"> </w:t>
       </w:r>
       <w:r>
-        <w:t>progress |</w:t>
+        <w:t xml:space="preserve">progress </w:t>
+      </w:r>
+      <w:proofErr w:type="gramStart"/>
+      <w:r>
+        <w:t>|</w:t>
       </w:r>
       <w:r>
-        <w:t xml:space="preserve">  Blocked  |  Planned</w:t>
+        <w:t xml:space="preserve">  Blocked</w:t>
       </w:r>
+      <w:proofErr w:type="gramEnd"/>
+      <w:r>
+        <w:t xml:space="preserve">  </w:t>
+      </w:r>
+      <w:proofErr w:type="gramStart"/>
+      <w:r>
+        <w:t>|  Planned</w:t>
+      </w:r>
+      <w:proofErr w:type="gramEnd"/>
     </w:p>
     <w:tbl>
       <w:tblPr>
@@ -210,11 +231,10 @@
       </w:tblPr>
       <w:tblGrid>
         <w:gridCol w:w="691"/>
-        <w:gridCol w:w="2188"/>
-        <w:gridCol w:w="1756"/>
+        <w:gridCol w:w="3198"/>
+        <w:gridCol w:w="2190"/>
         <w:gridCol w:w="1123"/>
-        <w:gridCol w:w="1180"/>
-        <w:gridCol w:w="3096"/>
+        <w:gridCol w:w="1382"/>
       </w:tblGrid>
       <w:tr>
         <w:trPr>
@@ -250,7 +270,7 @@
         </w:tc>
         <w:tc>
           <w:tcPr>
-            <w:tcW w:w="2188" w:type="dxa"/>
+            <w:tcW w:w="3198" w:type="dxa"/>
             <w:shd w:val="clear" w:color="auto" w:fill="17365D"/>
             <w:tcMar>
               <w:top w:w="70" w:type="dxa"/>
@@ -276,7 +296,7 @@
         </w:tc>
         <w:tc>
           <w:tcPr>
-            <w:tcW w:w="1756" w:type="dxa"/>
+            <w:tcW w:w="2190" w:type="dxa"/>
             <w:shd w:val="clear" w:color="auto" w:fill="17365D"/>
             <w:tcMar>
               <w:top w:w="70" w:type="dxa"/>
@@ -328,7 +348,7 @@
         </w:tc>
         <w:tc>
           <w:tcPr>
-            <w:tcW w:w="1180" w:type="dxa"/>
+            <w:tcW w:w="1382" w:type="dxa"/>
             <w:shd w:val="clear" w:color="auto" w:fill="17365D"/>
             <w:tcMar>
               <w:top w:w="70" w:type="dxa"/>
@@ -349,32 +369,6 @@
                 <w:sz w:val="14"/>
               </w:rPr>
               <w:t>Completion date</w:t>
-            </w:r>
-          </w:p>
-        </w:tc>
-        <w:tc>
-          <w:tcPr>
-            <w:tcW w:w="3096" w:type="dxa"/>
-            <w:shd w:val="clear" w:color="auto" w:fill="17365D"/>
-            <w:tcMar>
-              <w:top w:w="70" w:type="dxa"/>
-              <w:left w:w="80" w:type="dxa"/>
-              <w:bottom w:w="70" w:type="dxa"/>
-              <w:right w:w="80" w:type="dxa"/>
-            </w:tcMar>
-            <w:vAlign w:val="center"/>
-          </w:tcPr>
-          <w:p>
-            <w:pPr>
-              <w:spacing w:after="0" w:line="240" w:lineRule="auto"/>
-            </w:pPr>
-            <w:r>
-              <w:rPr>
-                <w:b/>
-                <w:color w:val="FFFFFF"/>
-                <w:sz w:val="14"/>
-              </w:rPr>
-              <w:t>Issues / notes</w:t>
             </w:r>
           </w:p>
         </w:tc>
@@ -412,7 +406,7 @@
         </w:tc>
         <w:tc>
           <w:tcPr>
-            <w:tcW w:w="2188" w:type="dxa"/>
+            <w:tcW w:w="3198" w:type="dxa"/>
             <w:shd w:val="clear" w:color="auto" w:fill="FFFFFF"/>
             <w:tcMar>
               <w:top w:w="70" w:type="dxa"/>
@@ -437,7 +431,7 @@
         </w:tc>
         <w:tc>
           <w:tcPr>
-            <w:tcW w:w="1756" w:type="dxa"/>
+            <w:tcW w:w="2190" w:type="dxa"/>
             <w:shd w:val="clear" w:color="auto" w:fill="FFFFFF"/>
             <w:tcMar>
               <w:top w:w="70" w:type="dxa"/>
@@ -488,7 +482,7 @@
         </w:tc>
         <w:tc>
           <w:tcPr>
-            <w:tcW w:w="1180" w:type="dxa"/>
+            <w:tcW w:w="1382" w:type="dxa"/>
             <w:shd w:val="clear" w:color="auto" w:fill="FFFFFF"/>
             <w:tcMar>
               <w:top w:w="70" w:type="dxa"/>
@@ -508,31 +502,6 @@
                 <w:sz w:val="14"/>
               </w:rPr>
               <w:t>2026-10-15</w:t>
-            </w:r>
-          </w:p>
-        </w:tc>
-        <w:tc>
-          <w:tcPr>
-            <w:tcW w:w="3096" w:type="dxa"/>
-            <w:shd w:val="clear" w:color="auto" w:fill="FFFFFF"/>
-            <w:tcMar>
-              <w:top w:w="70" w:type="dxa"/>
-              <w:left w:w="80" w:type="dxa"/>
-              <w:bottom w:w="70" w:type="dxa"/>
-              <w:right w:w="80" w:type="dxa"/>
-            </w:tcMar>
-            <w:vAlign w:val="center"/>
-          </w:tcPr>
-          <w:p>
-            <w:pPr>
-              <w:spacing w:after="0" w:line="240" w:lineRule="auto"/>
-            </w:pPr>
-            <w:r>
-              <w:rPr>
-                <w:color w:val="1E293B"/>
-                <w:sz w:val="14"/>
-              </w:rPr>
-              <w:t>Baseline proposal and folder structure prepared; source CSV still absent.</w:t>
             </w:r>
           </w:p>
         </w:tc>
@@ -570,7 +539,7 @@
         </w:tc>
         <w:tc>
           <w:tcPr>
-            <w:tcW w:w="2188" w:type="dxa"/>
+            <w:tcW w:w="3198" w:type="dxa"/>
             <w:shd w:val="clear" w:color="auto" w:fill="F4F7FB"/>
             <w:tcMar>
               <w:top w:w="70" w:type="dxa"/>
@@ -595,7 +564,7 @@
         </w:tc>
         <w:tc>
           <w:tcPr>
-            <w:tcW w:w="1756" w:type="dxa"/>
+            <w:tcW w:w="2190" w:type="dxa"/>
             <w:shd w:val="clear" w:color="auto" w:fill="F4F7FB"/>
             <w:tcMar>
               <w:top w:w="70" w:type="dxa"/>
@@ -646,7 +615,7 @@
         </w:tc>
         <w:tc>
           <w:tcPr>
-            <w:tcW w:w="1180" w:type="dxa"/>
+            <w:tcW w:w="1382" w:type="dxa"/>
             <w:shd w:val="clear" w:color="auto" w:fill="F4F7FB"/>
             <w:tcMar>
               <w:top w:w="70" w:type="dxa"/>
@@ -666,31 +635,6 @@
                 <w:sz w:val="14"/>
               </w:rPr>
               <w:t>2026 – 10 - 15</w:t>
-            </w:r>
-          </w:p>
-        </w:tc>
-        <w:tc>
-          <w:tcPr>
-            <w:tcW w:w="3096" w:type="dxa"/>
-            <w:shd w:val="clear" w:color="auto" w:fill="F4F7FB"/>
-            <w:tcMar>
-              <w:top w:w="70" w:type="dxa"/>
-              <w:left w:w="80" w:type="dxa"/>
-              <w:bottom w:w="70" w:type="dxa"/>
-              <w:right w:w="80" w:type="dxa"/>
-            </w:tcMar>
-            <w:vAlign w:val="center"/>
-          </w:tcPr>
-          <w:p>
-            <w:pPr>
-              <w:spacing w:after="0" w:line="240" w:lineRule="auto"/>
-            </w:pPr>
-            <w:r>
-              <w:rPr>
-                <w:color w:val="1E293B"/>
-                <w:sz w:val="14"/>
-              </w:rPr>
-              <w:t>sales_data.csv is not present; verify source and licence before use.</w:t>
             </w:r>
           </w:p>
         </w:tc>
@@ -728,7 +672,7 @@
         </w:tc>
         <w:tc>
           <w:tcPr>
-            <w:tcW w:w="2188" w:type="dxa"/>
+            <w:tcW w:w="3198" w:type="dxa"/>
             <w:shd w:val="clear" w:color="auto" w:fill="FFFFFF"/>
             <w:tcMar>
               <w:top w:w="70" w:type="dxa"/>
@@ -753,7 +697,7 @@
         </w:tc>
         <w:tc>
           <w:tcPr>
-            <w:tcW w:w="1756" w:type="dxa"/>
+            <w:tcW w:w="2190" w:type="dxa"/>
             <w:shd w:val="clear" w:color="auto" w:fill="FFFFFF"/>
             <w:tcMar>
               <w:top w:w="70" w:type="dxa"/>
@@ -804,7 +748,7 @@
         </w:tc>
         <w:tc>
           <w:tcPr>
-            <w:tcW w:w="1180" w:type="dxa"/>
+            <w:tcW w:w="1382" w:type="dxa"/>
             <w:shd w:val="clear" w:color="auto" w:fill="FFFFFF"/>
             <w:tcMar>
               <w:top w:w="70" w:type="dxa"/>
@@ -824,31 +768,6 @@
                 <w:sz w:val="14"/>
               </w:rPr>
               <w:t>2026 – 10 - 15</w:t>
-            </w:r>
-          </w:p>
-        </w:tc>
-        <w:tc>
-          <w:tcPr>
-            <w:tcW w:w="3096" w:type="dxa"/>
-            <w:shd w:val="clear" w:color="auto" w:fill="FFFFFF"/>
-            <w:tcMar>
-              <w:top w:w="70" w:type="dxa"/>
-              <w:left w:w="80" w:type="dxa"/>
-              <w:bottom w:w="70" w:type="dxa"/>
-              <w:right w:w="80" w:type="dxa"/>
-            </w:tcMar>
-            <w:vAlign w:val="center"/>
-          </w:tcPr>
-          <w:p>
-            <w:pPr>
-              <w:spacing w:after="0" w:line="240" w:lineRule="auto"/>
-            </w:pPr>
-            <w:r>
-              <w:rPr>
-                <w:color w:val="1E293B"/>
-                <w:sz w:val="14"/>
-              </w:rPr>
-              <w:t>Requires the source CSV; proposal profile has not been independently verified.</w:t>
             </w:r>
           </w:p>
         </w:tc>
@@ -886,7 +805,7 @@
         </w:tc>
         <w:tc>
           <w:tcPr>
-            <w:tcW w:w="2188" w:type="dxa"/>
+            <w:tcW w:w="3198" w:type="dxa"/>
             <w:shd w:val="clear" w:color="auto" w:fill="F4F7FB"/>
             <w:tcMar>
               <w:top w:w="70" w:type="dxa"/>
@@ -911,7 +830,7 @@
         </w:tc>
         <w:tc>
           <w:tcPr>
-            <w:tcW w:w="1756" w:type="dxa"/>
+            <w:tcW w:w="2190" w:type="dxa"/>
             <w:shd w:val="clear" w:color="auto" w:fill="F4F7FB"/>
             <w:tcMar>
               <w:top w:w="70" w:type="dxa"/>
@@ -962,7 +881,7 @@
         </w:tc>
         <w:tc>
           <w:tcPr>
-            <w:tcW w:w="1180" w:type="dxa"/>
+            <w:tcW w:w="1382" w:type="dxa"/>
             <w:shd w:val="clear" w:color="auto" w:fill="F4F7FB"/>
             <w:tcMar>
               <w:top w:w="70" w:type="dxa"/>
@@ -982,31 +901,6 @@
                 <w:sz w:val="14"/>
               </w:rPr>
               <w:t>2026 – 10 - 16</w:t>
-            </w:r>
-          </w:p>
-        </w:tc>
-        <w:tc>
-          <w:tcPr>
-            <w:tcW w:w="3096" w:type="dxa"/>
-            <w:shd w:val="clear" w:color="auto" w:fill="F4F7FB"/>
-            <w:tcMar>
-              <w:top w:w="70" w:type="dxa"/>
-              <w:left w:w="80" w:type="dxa"/>
-              <w:bottom w:w="70" w:type="dxa"/>
-              <w:right w:w="80" w:type="dxa"/>
-            </w:tcMar>
-            <w:vAlign w:val="center"/>
-          </w:tcPr>
-          <w:p>
-            <w:pPr>
-              <w:spacing w:after="0" w:line="240" w:lineRule="auto"/>
-            </w:pPr>
-            <w:r>
-              <w:rPr>
-                <w:color w:val="1E293B"/>
-                <w:sz w:val="14"/>
-              </w:rPr>
-              <w:t>Preserve raw source; requires PM-02 and PM-03.</w:t>
             </w:r>
           </w:p>
         </w:tc>
@@ -1044,7 +938,7 @@
         </w:tc>
         <w:tc>
           <w:tcPr>
-            <w:tcW w:w="2188" w:type="dxa"/>
+            <w:tcW w:w="3198" w:type="dxa"/>
             <w:shd w:val="clear" w:color="auto" w:fill="FFFFFF"/>
             <w:tcMar>
               <w:top w:w="70" w:type="dxa"/>
@@ -1069,7 +963,7 @@
         </w:tc>
         <w:tc>
           <w:tcPr>
-            <w:tcW w:w="1756" w:type="dxa"/>
+            <w:tcW w:w="2190" w:type="dxa"/>
             <w:shd w:val="clear" w:color="auto" w:fill="FFFFFF"/>
             <w:tcMar>
               <w:top w:w="70" w:type="dxa"/>
@@ -1120,7 +1014,7 @@
         </w:tc>
         <w:tc>
           <w:tcPr>
-            <w:tcW w:w="1180" w:type="dxa"/>
+            <w:tcW w:w="1382" w:type="dxa"/>
             <w:shd w:val="clear" w:color="auto" w:fill="FFFFFF"/>
             <w:tcMar>
               <w:top w:w="70" w:type="dxa"/>
@@ -1139,32 +1033,7 @@
                 <w:color w:val="1E293B"/>
                 <w:sz w:val="14"/>
               </w:rPr>
-              <w:t xml:space="preserve">2026 – 10 - </w:t>
-            </w:r>
-          </w:p>
-        </w:tc>
-        <w:tc>
-          <w:tcPr>
-            <w:tcW w:w="3096" w:type="dxa"/>
-            <w:shd w:val="clear" w:color="auto" w:fill="FFFFFF"/>
-            <w:tcMar>
-              <w:top w:w="70" w:type="dxa"/>
-              <w:left w:w="80" w:type="dxa"/>
-              <w:bottom w:w="70" w:type="dxa"/>
-              <w:right w:w="80" w:type="dxa"/>
-            </w:tcMar>
-            <w:vAlign w:val="center"/>
-          </w:tcPr>
-          <w:p>
-            <w:pPr>
-              <w:spacing w:after="0" w:line="240" w:lineRule="auto"/>
-            </w:pPr>
-            <w:r>
-              <w:rPr>
-                <w:color w:val="1E293B"/>
-                <w:sz w:val="14"/>
-              </w:rPr>
-              <w:t>Validate record grain and calculation rules on actual data.</w:t>
+              <w:t>2026 – 10 - 16</w:t>
             </w:r>
           </w:p>
         </w:tc>
@@ -1202,7 +1071,7 @@
         </w:tc>
         <w:tc>
           <w:tcPr>
-            <w:tcW w:w="2188" w:type="dxa"/>
+            <w:tcW w:w="3198" w:type="dxa"/>
             <w:shd w:val="clear" w:color="auto" w:fill="F4F7FB"/>
             <w:tcMar>
               <w:top w:w="70" w:type="dxa"/>
@@ -1227,7 +1096,7 @@
         </w:tc>
         <w:tc>
           <w:tcPr>
-            <w:tcW w:w="1756" w:type="dxa"/>
+            <w:tcW w:w="2190" w:type="dxa"/>
             <w:shd w:val="clear" w:color="auto" w:fill="F4F7FB"/>
             <w:tcMar>
               <w:top w:w="70" w:type="dxa"/>
@@ -1271,13 +1140,13 @@
                 <w:color w:val="1E293B"/>
                 <w:sz w:val="14"/>
               </w:rPr>
-              <w:t>Planned</w:t>
+              <w:t>completed</w:t>
             </w:r>
           </w:p>
         </w:tc>
         <w:tc>
           <w:tcPr>
-            <w:tcW w:w="1180" w:type="dxa"/>
+            <w:tcW w:w="1382" w:type="dxa"/>
             <w:shd w:val="clear" w:color="auto" w:fill="F4F7FB"/>
             <w:tcMar>
               <w:top w:w="70" w:type="dxa"/>
@@ -1296,32 +1165,7 @@
                 <w:color w:val="1E293B"/>
                 <w:sz w:val="14"/>
               </w:rPr>
-              <w:t>—</w:t>
-            </w:r>
-          </w:p>
-        </w:tc>
-        <w:tc>
-          <w:tcPr>
-            <w:tcW w:w="3096" w:type="dxa"/>
-            <w:shd w:val="clear" w:color="auto" w:fill="F4F7FB"/>
-            <w:tcMar>
-              <w:top w:w="70" w:type="dxa"/>
-              <w:left w:w="80" w:type="dxa"/>
-              <w:bottom w:w="70" w:type="dxa"/>
-              <w:right w:w="80" w:type="dxa"/>
-            </w:tcMar>
-            <w:vAlign w:val="center"/>
-          </w:tcPr>
-          <w:p>
-            <w:pPr>
-              <w:spacing w:after="0" w:line="240" w:lineRule="auto"/>
-            </w:pPr>
-            <w:r>
-              <w:rPr>
-                <w:color w:val="1E293B"/>
-                <w:sz w:val="14"/>
-              </w:rPr>
-              <w:t>Build after data cleaning and validation.</w:t>
+              <w:t>2026-10-18</w:t>
             </w:r>
           </w:p>
         </w:tc>
@@ -1359,7 +1203,7 @@
         </w:tc>
         <w:tc>
           <w:tcPr>
-            <w:tcW w:w="2188" w:type="dxa"/>
+            <w:tcW w:w="3198" w:type="dxa"/>
             <w:shd w:val="clear" w:color="auto" w:fill="FFFFFF"/>
             <w:tcMar>
               <w:top w:w="70" w:type="dxa"/>
@@ -1384,7 +1228,7 @@
         </w:tc>
         <w:tc>
           <w:tcPr>
-            <w:tcW w:w="1756" w:type="dxa"/>
+            <w:tcW w:w="2190" w:type="dxa"/>
             <w:shd w:val="clear" w:color="auto" w:fill="FFFFFF"/>
             <w:tcMar>
               <w:top w:w="70" w:type="dxa"/>
@@ -1428,13 +1272,13 @@
                 <w:color w:val="1E293B"/>
                 <w:sz w:val="14"/>
               </w:rPr>
-              <w:t>Planned</w:t>
+              <w:t>completed</w:t>
             </w:r>
           </w:p>
         </w:tc>
         <w:tc>
           <w:tcPr>
-            <w:tcW w:w="1180" w:type="dxa"/>
+            <w:tcW w:w="1382" w:type="dxa"/>
             <w:shd w:val="clear" w:color="auto" w:fill="FFFFFF"/>
             <w:tcMar>
               <w:top w:w="70" w:type="dxa"/>
@@ -1449,36 +1293,7 @@
               <w:spacing w:after="0" w:line="240" w:lineRule="auto"/>
             </w:pPr>
             <w:r>
-              <w:rPr>
-                <w:color w:val="1E293B"/>
-                <w:sz w:val="14"/>
-              </w:rPr>
-              <w:t>—</w:t>
-            </w:r>
-          </w:p>
-        </w:tc>
-        <w:tc>
-          <w:tcPr>
-            <w:tcW w:w="3096" w:type="dxa"/>
-            <w:shd w:val="clear" w:color="auto" w:fill="FFFFFF"/>
-            <w:tcMar>
-              <w:top w:w="70" w:type="dxa"/>
-              <w:left w:w="80" w:type="dxa"/>
-              <w:bottom w:w="70" w:type="dxa"/>
-              <w:right w:w="80" w:type="dxa"/>
-            </w:tcMar>
-            <w:vAlign w:val="center"/>
-          </w:tcPr>
-          <w:p>
-            <w:pPr>
-              <w:spacing w:after="0" w:line="240" w:lineRule="auto"/>
-            </w:pPr>
-            <w:r>
-              <w:rPr>
-                <w:color w:val="1E293B"/>
-                <w:sz w:val="14"/>
-              </w:rPr>
-              <w:t>Findings must be supported by validated data.</w:t>
+              <w:t>2026-10-19</w:t>
             </w:r>
           </w:p>
         </w:tc>
@@ -1516,7 +1331,7 @@
         </w:tc>
         <w:tc>
           <w:tcPr>
-            <w:tcW w:w="2188" w:type="dxa"/>
+            <w:tcW w:w="3198" w:type="dxa"/>
             <w:shd w:val="clear" w:color="auto" w:fill="F4F7FB"/>
             <w:tcMar>
               <w:top w:w="70" w:type="dxa"/>
@@ -1541,7 +1356,7 @@
         </w:tc>
         <w:tc>
           <w:tcPr>
-            <w:tcW w:w="1756" w:type="dxa"/>
+            <w:tcW w:w="2190" w:type="dxa"/>
             <w:shd w:val="clear" w:color="auto" w:fill="F4F7FB"/>
             <w:tcMar>
               <w:top w:w="70" w:type="dxa"/>
@@ -1585,13 +1400,13 @@
                 <w:color w:val="1E293B"/>
                 <w:sz w:val="14"/>
               </w:rPr>
-              <w:t>Planned</w:t>
+              <w:t>completed</w:t>
             </w:r>
           </w:p>
         </w:tc>
         <w:tc>
           <w:tcPr>
-            <w:tcW w:w="1180" w:type="dxa"/>
+            <w:tcW w:w="1382" w:type="dxa"/>
             <w:shd w:val="clear" w:color="auto" w:fill="F4F7FB"/>
             <w:tcMar>
               <w:top w:w="70" w:type="dxa"/>
@@ -1606,36 +1421,7 @@
               <w:spacing w:after="0" w:line="240" w:lineRule="auto"/>
             </w:pPr>
             <w:r>
-              <w:rPr>
-                <w:color w:val="1E293B"/>
-                <w:sz w:val="14"/>
-              </w:rPr>
-              <w:t>—</w:t>
-            </w:r>
-          </w:p>
-        </w:tc>
-        <w:tc>
-          <w:tcPr>
-            <w:tcW w:w="3096" w:type="dxa"/>
-            <w:shd w:val="clear" w:color="auto" w:fill="F4F7FB"/>
-            <w:tcMar>
-              <w:top w:w="70" w:type="dxa"/>
-              <w:left w:w="80" w:type="dxa"/>
-              <w:bottom w:w="70" w:type="dxa"/>
-              <w:right w:w="80" w:type="dxa"/>
-            </w:tcMar>
-            <w:vAlign w:val="center"/>
-          </w:tcPr>
-          <w:p>
-            <w:pPr>
-              <w:spacing w:after="0" w:line="240" w:lineRule="auto"/>
-            </w:pPr>
-            <w:r>
-              <w:rPr>
-                <w:color w:val="1E293B"/>
-                <w:sz w:val="14"/>
-              </w:rPr>
-              <w:t>Check completeness and comparable periods.</w:t>
+              <w:t>2026-10-19</w:t>
             </w:r>
           </w:p>
         </w:tc>
@@ -1673,7 +1459,7 @@
         </w:tc>
         <w:tc>
           <w:tcPr>
-            <w:tcW w:w="2188" w:type="dxa"/>
+            <w:tcW w:w="3198" w:type="dxa"/>
             <w:shd w:val="clear" w:color="auto" w:fill="FFFFFF"/>
             <w:tcMar>
               <w:top w:w="70" w:type="dxa"/>
@@ -1698,7 +1484,7 @@
         </w:tc>
         <w:tc>
           <w:tcPr>
-            <w:tcW w:w="1756" w:type="dxa"/>
+            <w:tcW w:w="2190" w:type="dxa"/>
             <w:shd w:val="clear" w:color="auto" w:fill="FFFFFF"/>
             <w:tcMar>
               <w:top w:w="70" w:type="dxa"/>
@@ -1742,13 +1528,13 @@
                 <w:color w:val="1E293B"/>
                 <w:sz w:val="14"/>
               </w:rPr>
-              <w:t>Planned</w:t>
+              <w:t>completed</w:t>
             </w:r>
           </w:p>
         </w:tc>
         <w:tc>
           <w:tcPr>
-            <w:tcW w:w="1180" w:type="dxa"/>
+            <w:tcW w:w="1382" w:type="dxa"/>
             <w:shd w:val="clear" w:color="auto" w:fill="FFFFFF"/>
             <w:tcMar>
               <w:top w:w="70" w:type="dxa"/>
@@ -1763,36 +1549,7 @@
               <w:spacing w:after="0" w:line="240" w:lineRule="auto"/>
             </w:pPr>
             <w:r>
-              <w:rPr>
-                <w:color w:val="1E293B"/>
-                <w:sz w:val="14"/>
-              </w:rPr>
-              <w:t>—</w:t>
-            </w:r>
-          </w:p>
-        </w:tc>
-        <w:tc>
-          <w:tcPr>
-            <w:tcW w:w="3096" w:type="dxa"/>
-            <w:shd w:val="clear" w:color="auto" w:fill="FFFFFF"/>
-            <w:tcMar>
-              <w:top w:w="70" w:type="dxa"/>
-              <w:left w:w="80" w:type="dxa"/>
-              <w:bottom w:w="70" w:type="dxa"/>
-              <w:right w:w="80" w:type="dxa"/>
-            </w:tcMar>
-            <w:vAlign w:val="center"/>
-          </w:tcPr>
-          <w:p>
-            <w:pPr>
-              <w:spacing w:after="0" w:line="240" w:lineRule="auto"/>
-            </w:pPr>
-            <w:r>
-              <w:rPr>
-                <w:color w:val="1E293B"/>
-                <w:sz w:val="14"/>
-              </w:rPr>
-              <w:t>Validate definitions and aggregation before dashboard use.</w:t>
+              <w:t>2026-10-19</w:t>
             </w:r>
           </w:p>
         </w:tc>
@@ -1830,7 +1587,7 @@
         </w:tc>
         <w:tc>
           <w:tcPr>
-            <w:tcW w:w="2188" w:type="dxa"/>
+            <w:tcW w:w="3198" w:type="dxa"/>
             <w:shd w:val="clear" w:color="auto" w:fill="F4F7FB"/>
             <w:tcMar>
               <w:top w:w="70" w:type="dxa"/>
@@ -1855,7 +1612,7 @@
         </w:tc>
         <w:tc>
           <w:tcPr>
-            <w:tcW w:w="1756" w:type="dxa"/>
+            <w:tcW w:w="2190" w:type="dxa"/>
             <w:shd w:val="clear" w:color="auto" w:fill="F4F7FB"/>
             <w:tcMar>
               <w:top w:w="70" w:type="dxa"/>
@@ -1899,13 +1656,13 @@
                 <w:color w:val="1E293B"/>
                 <w:sz w:val="14"/>
               </w:rPr>
-              <w:t>Planned</w:t>
+              <w:t>completed</w:t>
             </w:r>
           </w:p>
         </w:tc>
         <w:tc>
           <w:tcPr>
-            <w:tcW w:w="1180" w:type="dxa"/>
+            <w:tcW w:w="1382" w:type="dxa"/>
             <w:shd w:val="clear" w:color="auto" w:fill="F4F7FB"/>
             <w:tcMar>
               <w:top w:w="70" w:type="dxa"/>
@@ -1920,36 +1677,7 @@
               <w:spacing w:after="0" w:line="240" w:lineRule="auto"/>
             </w:pPr>
             <w:r>
-              <w:rPr>
-                <w:color w:val="1E293B"/>
-                <w:sz w:val="14"/>
-              </w:rPr>
-              <w:t>—</w:t>
-            </w:r>
-          </w:p>
-        </w:tc>
-        <w:tc>
-          <w:tcPr>
-            <w:tcW w:w="3096" w:type="dxa"/>
-            <w:shd w:val="clear" w:color="auto" w:fill="F4F7FB"/>
-            <w:tcMar>
-              <w:top w:w="70" w:type="dxa"/>
-              <w:left w:w="80" w:type="dxa"/>
-              <w:bottom w:w="70" w:type="dxa"/>
-              <w:right w:w="80" w:type="dxa"/>
-            </w:tcMar>
-            <w:vAlign w:val="center"/>
-          </w:tcPr>
-          <w:p>
-            <w:pPr>
-              <w:spacing w:after="0" w:line="240" w:lineRule="auto"/>
-            </w:pPr>
-            <w:r>
-              <w:rPr>
-                <w:color w:val="1E293B"/>
-                <w:sz w:val="14"/>
-              </w:rPr>
-              <w:t>Requires validated data and KPIs.</w:t>
+              <w:t>2026-10-19</w:t>
             </w:r>
           </w:p>
         </w:tc>
@@ -1987,7 +1715,7 @@
         </w:tc>
         <w:tc>
           <w:tcPr>
-            <w:tcW w:w="2188" w:type="dxa"/>
+            <w:tcW w:w="3198" w:type="dxa"/>
             <w:shd w:val="clear" w:color="auto" w:fill="FFFFFF"/>
             <w:tcMar>
               <w:top w:w="70" w:type="dxa"/>
@@ -2012,7 +1740,7 @@
         </w:tc>
         <w:tc>
           <w:tcPr>
-            <w:tcW w:w="1756" w:type="dxa"/>
+            <w:tcW w:w="2190" w:type="dxa"/>
             <w:shd w:val="clear" w:color="auto" w:fill="FFFFFF"/>
             <w:tcMar>
               <w:top w:w="70" w:type="dxa"/>
@@ -2062,7 +1790,7 @@
         </w:tc>
         <w:tc>
           <w:tcPr>
-            <w:tcW w:w="1180" w:type="dxa"/>
+            <w:tcW w:w="1382" w:type="dxa"/>
             <w:shd w:val="clear" w:color="auto" w:fill="FFFFFF"/>
             <w:tcMar>
               <w:top w:w="70" w:type="dxa"/>
@@ -2082,31 +1810,6 @@
                 <w:sz w:val="14"/>
               </w:rPr>
               <w:t>—</w:t>
-            </w:r>
-          </w:p>
-        </w:tc>
-        <w:tc>
-          <w:tcPr>
-            <w:tcW w:w="3096" w:type="dxa"/>
-            <w:shd w:val="clear" w:color="auto" w:fill="FFFFFF"/>
-            <w:tcMar>
-              <w:top w:w="70" w:type="dxa"/>
-              <w:left w:w="80" w:type="dxa"/>
-              <w:bottom w:w="70" w:type="dxa"/>
-              <w:right w:w="80" w:type="dxa"/>
-            </w:tcMar>
-            <w:vAlign w:val="center"/>
-          </w:tcPr>
-          <w:p>
-            <w:pPr>
-              <w:spacing w:after="0" w:line="240" w:lineRule="auto"/>
-            </w:pPr>
-            <w:r>
-              <w:rPr>
-                <w:color w:val="1E293B"/>
-                <w:sz w:val="14"/>
-              </w:rPr>
-              <w:t>Do not infer stockouts, lost sales, or causation without evidence.</w:t>
             </w:r>
           </w:p>
         </w:tc>
@@ -2144,7 +1847,7 @@
         </w:tc>
         <w:tc>
           <w:tcPr>
-            <w:tcW w:w="2188" w:type="dxa"/>
+            <w:tcW w:w="3198" w:type="dxa"/>
             <w:shd w:val="clear" w:color="auto" w:fill="F4F7FB"/>
             <w:tcMar>
               <w:top w:w="70" w:type="dxa"/>
@@ -2169,7 +1872,7 @@
         </w:tc>
         <w:tc>
           <w:tcPr>
-            <w:tcW w:w="1756" w:type="dxa"/>
+            <w:tcW w:w="2190" w:type="dxa"/>
             <w:shd w:val="clear" w:color="auto" w:fill="F4F7FB"/>
             <w:tcMar>
               <w:top w:w="70" w:type="dxa"/>
@@ -2219,7 +1922,7 @@
         </w:tc>
         <w:tc>
           <w:tcPr>
-            <w:tcW w:w="1180" w:type="dxa"/>
+            <w:tcW w:w="1382" w:type="dxa"/>
             <w:shd w:val="clear" w:color="auto" w:fill="F4F7FB"/>
             <w:tcMar>
               <w:top w:w="70" w:type="dxa"/>
@@ -2239,31 +1942,6 @@
                 <w:sz w:val="14"/>
               </w:rPr>
               <w:t>—</w:t>
-            </w:r>
-          </w:p>
-        </w:tc>
-        <w:tc>
-          <w:tcPr>
-            <w:tcW w:w="3096" w:type="dxa"/>
-            <w:shd w:val="clear" w:color="auto" w:fill="F4F7FB"/>
-            <w:tcMar>
-              <w:top w:w="70" w:type="dxa"/>
-              <w:left w:w="80" w:type="dxa"/>
-              <w:bottom w:w="70" w:type="dxa"/>
-              <w:right w:w="80" w:type="dxa"/>
-            </w:tcMar>
-            <w:vAlign w:val="center"/>
-          </w:tcPr>
-          <w:p>
-            <w:pPr>
-              <w:spacing w:after="0" w:line="240" w:lineRule="auto"/>
-            </w:pPr>
-            <w:r>
-              <w:rPr>
-                <w:color w:val="1E293B"/>
-                <w:sz w:val="14"/>
-              </w:rPr>
-              <w:t>Baseline documents created; update with verified results as work proceeds.</w:t>
             </w:r>
           </w:p>
         </w:tc>
@@ -2301,7 +1979,7 @@
         </w:tc>
         <w:tc>
           <w:tcPr>
-            <w:tcW w:w="2188" w:type="dxa"/>
+            <w:tcW w:w="3198" w:type="dxa"/>
             <w:shd w:val="clear" w:color="auto" w:fill="FFFFFF"/>
             <w:tcMar>
               <w:top w:w="70" w:type="dxa"/>
@@ -2326,7 +2004,7 @@
         </w:tc>
         <w:tc>
           <w:tcPr>
-            <w:tcW w:w="1756" w:type="dxa"/>
+            <w:tcW w:w="2190" w:type="dxa"/>
             <w:shd w:val="clear" w:color="auto" w:fill="FFFFFF"/>
             <w:tcMar>
               <w:top w:w="70" w:type="dxa"/>
@@ -2376,7 +2054,7 @@
         </w:tc>
         <w:tc>
           <w:tcPr>
-            <w:tcW w:w="1180" w:type="dxa"/>
+            <w:tcW w:w="1382" w:type="dxa"/>
             <w:shd w:val="clear" w:color="auto" w:fill="FFFFFF"/>
             <w:tcMar>
               <w:top w:w="70" w:type="dxa"/>
@@ -2396,31 +2074,6 @@
                 <w:sz w:val="14"/>
               </w:rPr>
               <w:t>—</w:t>
-            </w:r>
-          </w:p>
-        </w:tc>
-        <w:tc>
-          <w:tcPr>
-            <w:tcW w:w="3096" w:type="dxa"/>
-            <w:shd w:val="clear" w:color="auto" w:fill="FFFFFF"/>
-            <w:tcMar>
-              <w:top w:w="70" w:type="dxa"/>
-              <w:left w:w="80" w:type="dxa"/>
-              <w:bottom w:w="70" w:type="dxa"/>
-              <w:right w:w="80" w:type="dxa"/>
-            </w:tcMar>
-            <w:vAlign w:val="center"/>
-          </w:tcPr>
-          <w:p>
-            <w:pPr>
-              <w:spacing w:after="0" w:line="240" w:lineRule="auto"/>
-            </w:pPr>
-            <w:r>
-              <w:rPr>
-                <w:color w:val="1E293B"/>
-                <w:sz w:val="14"/>
-              </w:rPr>
-              <w:t>Check dataset licence and exclude restricted data before publishing.</w:t>
             </w:r>
           </w:p>
         </w:tc>
@@ -2458,7 +2111,7 @@
         </w:tc>
         <w:tc>
           <w:tcPr>
-            <w:tcW w:w="2188" w:type="dxa"/>
+            <w:tcW w:w="3198" w:type="dxa"/>
             <w:shd w:val="clear" w:color="auto" w:fill="F4F7FB"/>
             <w:tcMar>
               <w:top w:w="70" w:type="dxa"/>
@@ -2483,7 +2136,7 @@
         </w:tc>
         <w:tc>
           <w:tcPr>
-            <w:tcW w:w="1756" w:type="dxa"/>
+            <w:tcW w:w="2190" w:type="dxa"/>
             <w:shd w:val="clear" w:color="auto" w:fill="F4F7FB"/>
             <w:tcMar>
               <w:top w:w="70" w:type="dxa"/>
@@ -2533,7 +2186,7 @@
         </w:tc>
         <w:tc>
           <w:tcPr>
-            <w:tcW w:w="1180" w:type="dxa"/>
+            <w:tcW w:w="1382" w:type="dxa"/>
             <w:shd w:val="clear" w:color="auto" w:fill="F4F7FB"/>
             <w:tcMar>
               <w:top w:w="70" w:type="dxa"/>
@@ -2553,31 +2206,6 @@
                 <w:sz w:val="14"/>
               </w:rPr>
               <w:t>—</w:t>
-            </w:r>
-          </w:p>
-        </w:tc>
-        <w:tc>
-          <w:tcPr>
-            <w:tcW w:w="3096" w:type="dxa"/>
-            <w:shd w:val="clear" w:color="auto" w:fill="F4F7FB"/>
-            <w:tcMar>
-              <w:top w:w="70" w:type="dxa"/>
-              <w:left w:w="80" w:type="dxa"/>
-              <w:bottom w:w="70" w:type="dxa"/>
-              <w:right w:w="80" w:type="dxa"/>
-            </w:tcMar>
-            <w:vAlign w:val="center"/>
-          </w:tcPr>
-          <w:p>
-            <w:pPr>
-              <w:spacing w:after="0" w:line="240" w:lineRule="auto"/>
-            </w:pPr>
-            <w:r>
-              <w:rPr>
-                <w:color w:val="1E293B"/>
-                <w:sz w:val="14"/>
-              </w:rPr>
-              <w:t>Includes KPI reconciliation and final artifact review.</w:t>
             </w:r>
           </w:p>
         </w:tc>
@@ -2671,7 +2299,39 @@
         <w:color w:val="64748B"/>
         <w:sz w:val="16"/>
       </w:rPr>
-      <w:t xml:space="preserve">Project Management Plan  •  Baseline: 15 October 2026  •  Page </w:t>
+      <w:t xml:space="preserve">Project Management </w:t>
+    </w:r>
+    <w:proofErr w:type="gramStart"/>
+    <w:r>
+      <w:rPr>
+        <w:color w:val="64748B"/>
+        <w:sz w:val="16"/>
+      </w:rPr>
+      <w:t>Plan  •</w:t>
+    </w:r>
+    <w:proofErr w:type="gramEnd"/>
+    <w:r>
+      <w:rPr>
+        <w:color w:val="64748B"/>
+        <w:sz w:val="16"/>
+      </w:rPr>
+      <w:t xml:space="preserve">  Baseline: 15 October </w:t>
+    </w:r>
+    <w:proofErr w:type="gramStart"/>
+    <w:r>
+      <w:rPr>
+        <w:color w:val="64748B"/>
+        <w:sz w:val="16"/>
+      </w:rPr>
+      <w:t>2026  •</w:t>
+    </w:r>
+    <w:proofErr w:type="gramEnd"/>
+    <w:r>
+      <w:rPr>
+        <w:color w:val="64748B"/>
+        <w:sz w:val="16"/>
+      </w:rPr>
+      <w:t xml:space="preserve">  Page </w:t>
     </w:r>
     <w:r>
       <w:fldChar w:fldCharType="begin"/>
@@ -2733,7 +2393,25 @@
         <w:color w:val="64748B"/>
         <w:sz w:val="16"/>
       </w:rPr>
-      <w:t>PROJECT MANAGEMENT  |  INV-02</w:t>
+      <w:t xml:space="preserve">PROJECT </w:t>
+    </w:r>
+    <w:proofErr w:type="gramStart"/>
+    <w:r>
+      <w:rPr>
+        <w:b/>
+        <w:color w:val="64748B"/>
+        <w:sz w:val="16"/>
+      </w:rPr>
+      <w:t>MANAGEMENT  |</w:t>
+    </w:r>
+    <w:proofErr w:type="gramEnd"/>
+    <w:r>
+      <w:rPr>
+        <w:b/>
+        <w:color w:val="64748B"/>
+        <w:sz w:val="16"/>
+      </w:rPr>
+      <w:t xml:space="preserve">  INV-02</w:t>
     </w:r>
   </w:p>
 </w:hdr>

</xml_diff>

<commit_message>
Final quality-checked project has done
</commit_message>
<xml_diff>
--- a/docs/Project_Management_Plan_INV-02.docx
+++ b/docs/Project_Management_Plan_INV-02.docx
@@ -74,14 +74,7 @@
                 <w:color w:val="1E293B"/>
                 <w:sz w:val="16"/>
               </w:rPr>
-              <w:t xml:space="preserve">8 </w:t>
-            </w:r>
-            <w:r>
-              <w:rPr>
-                <w:color w:val="1E293B"/>
-                <w:sz w:val="16"/>
-              </w:rPr>
-              <w:t>planned working days</w:t>
+              <w:t>8 planned working days</w:t>
             </w:r>
           </w:p>
         </w:tc>
@@ -1677,7 +1670,10 @@
               <w:spacing w:after="0" w:line="240" w:lineRule="auto"/>
             </w:pPr>
             <w:r>
-              <w:t>2026-10-19</w:t>
+              <w:t>2026-10-</w:t>
+            </w:r>
+            <w:r>
+              <w:t>22</w:t>
             </w:r>
           </w:p>
         </w:tc>
@@ -1784,7 +1780,7 @@
                 <w:color w:val="1E293B"/>
                 <w:sz w:val="14"/>
               </w:rPr>
-              <w:t>Planned</w:t>
+              <w:t>Completed</w:t>
             </w:r>
           </w:p>
         </w:tc>
@@ -1809,7 +1805,7 @@
                 <w:color w:val="1E293B"/>
                 <w:sz w:val="14"/>
               </w:rPr>
-              <w:t>—</w:t>
+              <w:t>2026-10-22</w:t>
             </w:r>
           </w:p>
         </w:tc>
@@ -1916,7 +1912,7 @@
                 <w:color w:val="1E293B"/>
                 <w:sz w:val="14"/>
               </w:rPr>
-              <w:t>Planned</w:t>
+              <w:t>Completed</w:t>
             </w:r>
           </w:p>
         </w:tc>
@@ -1941,7 +1937,7 @@
                 <w:color w:val="1E293B"/>
                 <w:sz w:val="14"/>
               </w:rPr>
-              <w:t>—</w:t>
+              <w:t>2026-10-22</w:t>
             </w:r>
           </w:p>
         </w:tc>
@@ -2048,7 +2044,7 @@
                 <w:color w:val="1E293B"/>
                 <w:sz w:val="14"/>
               </w:rPr>
-              <w:t>Planned</w:t>
+              <w:t>Completed</w:t>
             </w:r>
           </w:p>
         </w:tc>
@@ -2073,7 +2069,7 @@
                 <w:color w:val="1E293B"/>
                 <w:sz w:val="14"/>
               </w:rPr>
-              <w:t>—</w:t>
+              <w:t>2026-10-22</w:t>
             </w:r>
           </w:p>
         </w:tc>
@@ -2180,7 +2176,7 @@
                 <w:color w:val="1E293B"/>
                 <w:sz w:val="14"/>
               </w:rPr>
-              <w:t>Planned</w:t>
+              <w:t>Completed</w:t>
             </w:r>
           </w:p>
         </w:tc>
@@ -2205,7 +2201,7 @@
                 <w:color w:val="1E293B"/>
                 <w:sz w:val="14"/>
               </w:rPr>
-              <w:t>—</w:t>
+              <w:t>2026-10-22</w:t>
             </w:r>
           </w:p>
         </w:tc>

</xml_diff>